<commit_message>
docs: update Methods R14 commit hash to 0e93660; update README
Methods R14: replace bf40566 with 0e93660 (current repo HEAD) in
the Methods cover sheet and M23 Data/Code Availability section.
README: list R14 Methods and R15 Results as current documents.

Co-Authored-By: Claude Sonnet 4.6 <noreply@anthropic.com>
Claude-Session: https://claude.ai/code/session_01VADmG4erFwh9AZJJyJ5yqP
</commit_message>
<xml_diff>
--- a/docs/Ofori_Prince_Phase1_Methods_R14.docx
+++ b/docs/Ofori_Prince_Phase1_Methods_R14.docx
@@ -525,7 +525,7 @@
           </w:tcPr>
           <w:p>
             <w:r>
-              <w:t>bf40566</w:t>
+              <w:t>0e93660</w:t>
             </w:r>
             <w:r>
               <w:rPr>
@@ -3302,7 +3302,7 @@
           <w:color w:val="000000"/>
           <w:sz w:val="24"/>
         </w:rPr>
-        <w:t>The full pipeline (kab_pipeline.py), both fold-level exports, summary_results.json and shap_importance.json are provided. The repository is to be made accessible to the verifier with the commit hash recorded here: bf40566 (GitHub: https://github.com/pofori80/kab-xgboost-wce-cybersecurity). Until the repository is accessible, full reproducibility cannot be independently confirmed; this is a stated limitation. The KNUST dataset is restricted under HuSSREC terms; the Alzubaidi dataset is public at doi:10.17632/fbs9mgmh4y.3.</w:t>
+        <w:t>The full pipeline (kab_pipeline.py), both fold-level exports, summary_results.json and shap_importance.json are provided. The repository is to be made accessible to the verifier with the commit hash recorded here: 0e93660 (GitHub: https://github.com/pofori80/kab-xgboost-wce-cybersecurity). Until the repository is accessible, full reproducibility cannot be independently confirmed; this is a stated limitation. The KNUST dataset is restricted under HuSSREC terms; the Alzubaidi dataset is public at doi:10.17632/fbs9mgmh4y.3.</w:t>
       </w:r>
     </w:p>
     <w:sectPr>

</xml_diff>

<commit_message>
docs: Methods R14 final hash update to 4b8848e
Co-Authored-By: Claude Sonnet 4.6 <noreply@anthropic.com>
Claude-Session: https://claude.ai/code/session_01VADmG4erFwh9AZJJyJ5yqP
</commit_message>
<xml_diff>
--- a/docs/Ofori_Prince_Phase1_Methods_R14.docx
+++ b/docs/Ofori_Prince_Phase1_Methods_R14.docx
@@ -525,7 +525,7 @@
           </w:tcPr>
           <w:p>
             <w:r>
-              <w:t>0e93660</w:t>
+              <w:t>4b8848e</w:t>
             </w:r>
             <w:r>
               <w:rPr>
@@ -3302,7 +3302,7 @@
           <w:color w:val="000000"/>
           <w:sz w:val="24"/>
         </w:rPr>
-        <w:t>The full pipeline (kab_pipeline.py), both fold-level exports, summary_results.json and shap_importance.json are provided. The repository is to be made accessible to the verifier with the commit hash recorded here: 0e93660 (GitHub: https://github.com/pofori80/kab-xgboost-wce-cybersecurity). Until the repository is accessible, full reproducibility cannot be independently confirmed; this is a stated limitation. The KNUST dataset is restricted under HuSSREC terms; the Alzubaidi dataset is public at doi:10.17632/fbs9mgmh4y.3.</w:t>
+        <w:t>The full pipeline (kab_pipeline.py), both fold-level exports, summary_results.json and shap_importance.json are provided. The repository is to be made accessible to the verifier with the commit hash recorded here: 4b8848e (GitHub: https://github.com/pofori80/kab-xgboost-wce-cybersecurity). Until the repository is accessible, full reproducibility cannot be independently confirmed; this is a stated limitation. The KNUST dataset is restricted under HuSSREC terms; the Alzubaidi dataset is public at doi:10.17632/fbs9mgmh4y.3.</w:t>
       </w:r>
     </w:p>
     <w:sectPr>

</xml_diff>